<commit_message>
Carta de cesión: ajustar como representante (hija) del titular fallecido
Co-Authored-By: Claude Opus 4.8 <noreply@anthropic.com>
Claude-Session: https://claude.ai/code/session_01Mmrn7JLAhSVspHUWxCQFPE
</commit_message>
<xml_diff>
--- a/Documentos/Carta_Cesion_Derechos_Gavetas.docx
+++ b/Documentos/Carta_Cesion_Derechos_Gavetas.docx
@@ -14,7 +14,6 @@
           <w:bCs w:val="false"/>
           <w:i w:val="false"/>
           <w:iCs w:val="false"/>
-          <w:caps w:val="false"/>
           <w:color w:val="1A1A1A"/>
           <w:sz w:val="24"/>
           <w:szCs w:val="24"/>
@@ -34,7 +33,6 @@
           <w:bCs/>
           <w:i w:val="false"/>
           <w:iCs w:val="false"/>
-          <w:caps w:val="false"/>
           <w:color w:val="1A1A1A"/>
           <w:sz w:val="24"/>
           <w:szCs w:val="24"/>
@@ -54,7 +52,6 @@
           <w:bCs/>
           <w:i w:val="false"/>
           <w:iCs w:val="false"/>
-          <w:caps w:val="false"/>
           <w:color w:val="1A1A1A"/>
           <w:sz w:val="24"/>
           <w:szCs w:val="24"/>
@@ -74,7 +71,6 @@
           <w:bCs/>
           <w:i w:val="false"/>
           <w:iCs w:val="false"/>
-          <w:caps w:val="false"/>
           <w:color w:val="1A1A1A"/>
           <w:sz w:val="24"/>
           <w:szCs w:val="24"/>
@@ -94,7 +90,6 @@
           <w:bCs/>
           <w:i w:val="false"/>
           <w:iCs w:val="false"/>
-          <w:caps w:val="false"/>
           <w:color w:val="1A1A1A"/>
           <w:sz w:val="24"/>
           <w:szCs w:val="24"/>
@@ -114,7 +109,6 @@
           <w:bCs/>
           <w:i w:val="false"/>
           <w:iCs w:val="false"/>
-          <w:caps w:val="false"/>
           <w:color w:val="1A1A1A"/>
           <w:sz w:val="24"/>
           <w:szCs w:val="24"/>
@@ -128,7 +122,6 @@
           <w:bCs w:val="false"/>
           <w:i w:val="false"/>
           <w:iCs w:val="false"/>
-          <w:caps w:val="false"/>
           <w:color w:val="1A1A1A"/>
           <w:sz w:val="24"/>
           <w:szCs w:val="24"/>
@@ -148,21 +141,90 @@
           <w:bCs w:val="false"/>
           <w:i w:val="false"/>
           <w:iCs w:val="false"/>
-          <w:caps w:val="false"/>
-          <w:color w:val="1A1A1A"/>
-          <w:sz w:val="24"/>
-          <w:szCs w:val="24"/>
-        </w:rPr>
-        <w:t xml:space="preserve">El que suscribe, </w:t>
-      </w:r>
-      <w:r>
-        <w:rPr>
-          <w:rFonts w:ascii="Times New Roman" w:cs="Times New Roman" w:eastAsia="Times New Roman" w:hAnsi="Times New Roman"/>
-          <w:b/>
-          <w:bCs/>
-          <w:i w:val="false"/>
-          <w:iCs w:val="false"/>
-          <w:caps w:val="false"/>
+          <w:color w:val="1A1A1A"/>
+          <w:sz w:val="24"/>
+          <w:szCs w:val="24"/>
+        </w:rPr>
+        <w:t xml:space="preserve">La que suscribe, </w:t>
+      </w:r>
+      <w:r>
+        <w:rPr>
+          <w:rFonts w:ascii="Times New Roman" w:cs="Times New Roman" w:eastAsia="Times New Roman" w:hAnsi="Times New Roman"/>
+          <w:b/>
+          <w:bCs/>
+          <w:i w:val="false"/>
+          <w:iCs w:val="false"/>
+          <w:color w:val="1A1A1A"/>
+          <w:sz w:val="24"/>
+          <w:szCs w:val="24"/>
+        </w:rPr>
+        <w:t xml:space="preserve">C. Adriana Margarita Pérez Román</w:t>
+      </w:r>
+      <w:r>
+        <w:rPr>
+          <w:rFonts w:ascii="Times New Roman" w:cs="Times New Roman" w:eastAsia="Times New Roman" w:hAnsi="Times New Roman"/>
+          <w:b w:val="false"/>
+          <w:bCs w:val="false"/>
+          <w:i w:val="false"/>
+          <w:iCs w:val="false"/>
+          <w:color w:val="1A1A1A"/>
+          <w:sz w:val="24"/>
+          <w:szCs w:val="24"/>
+        </w:rPr>
+        <w:t xml:space="preserve">, con domicilio en ________________________________________________, por mi propio derecho y en mi carácter de </w:t>
+      </w:r>
+      <w:r>
+        <w:rPr>
+          <w:rFonts w:ascii="Times New Roman" w:cs="Times New Roman" w:eastAsia="Times New Roman" w:hAnsi="Times New Roman"/>
+          <w:b/>
+          <w:bCs/>
+          <w:i w:val="false"/>
+          <w:iCs w:val="false"/>
+          <w:color w:val="1A1A1A"/>
+          <w:sz w:val="24"/>
+          <w:szCs w:val="24"/>
+        </w:rPr>
+        <w:t xml:space="preserve">hija del finado señor Carlos Pérez Ramírez</w:t>
+      </w:r>
+      <w:r>
+        <w:rPr>
+          <w:rFonts w:ascii="Times New Roman" w:cs="Times New Roman" w:eastAsia="Times New Roman" w:hAnsi="Times New Roman"/>
+          <w:b w:val="false"/>
+          <w:bCs w:val="false"/>
+          <w:i w:val="false"/>
+          <w:iCs w:val="false"/>
+          <w:color w:val="1A1A1A"/>
+          <w:sz w:val="24"/>
+          <w:szCs w:val="24"/>
+        </w:rPr>
+        <w:t xml:space="preserve">, de la manera más atenta me dirijo a usted para exponer y solicitar lo siguiente:</w:t>
+      </w:r>
+    </w:p>
+    <w:p>
+      <w:pPr>
+        <w:spacing w:after="200" w:line="276"/>
+        <w:jc w:val="both"/>
+      </w:pPr>
+      <w:r>
+        <w:rPr>
+          <w:rFonts w:ascii="Times New Roman" w:cs="Times New Roman" w:eastAsia="Times New Roman" w:hAnsi="Times New Roman"/>
+          <w:b w:val="false"/>
+          <w:bCs w:val="false"/>
+          <w:i w:val="false"/>
+          <w:iCs w:val="false"/>
+          <w:color w:val="1A1A1A"/>
+          <w:sz w:val="24"/>
+          <w:szCs w:val="24"/>
+        </w:rPr>
+        <w:t xml:space="preserve">Que mi señor padre, el </w:t>
+      </w:r>
+      <w:r>
+        <w:rPr>
+          <w:rFonts w:ascii="Times New Roman" w:cs="Times New Roman" w:eastAsia="Times New Roman" w:hAnsi="Times New Roman"/>
+          <w:b/>
+          <w:bCs/>
+          <w:i w:val="false"/>
+          <w:iCs w:val="false"/>
           <w:color w:val="1A1A1A"/>
           <w:sz w:val="24"/>
           <w:szCs w:val="24"/>
@@ -176,12 +238,89 @@
           <w:bCs w:val="false"/>
           <w:i w:val="false"/>
           <w:iCs w:val="false"/>
-          <w:caps w:val="false"/>
-          <w:color w:val="1A1A1A"/>
-          <w:sz w:val="24"/>
-          <w:szCs w:val="24"/>
-        </w:rPr>
-        <w:t xml:space="preserve">, con domicilio en Calle Víctor Rosales No. 154, Centro, Zacatecas, Zacatecas, por mi propio derecho y de la manera más atenta me dirijo a usted para exponer y solicitar lo siguiente:</w:t>
+          <w:color w:val="1A1A1A"/>
+          <w:sz w:val="24"/>
+          <w:szCs w:val="24"/>
+        </w:rPr>
+        <w:t xml:space="preserve">, quien en vida fue titular del </w:t>
+      </w:r>
+      <w:r>
+        <w:rPr>
+          <w:rFonts w:ascii="Times New Roman" w:cs="Times New Roman" w:eastAsia="Times New Roman" w:hAnsi="Times New Roman"/>
+          <w:b/>
+          <w:bCs/>
+          <w:i w:val="false"/>
+          <w:iCs w:val="false"/>
+          <w:color w:val="1A1A1A"/>
+          <w:sz w:val="24"/>
+          <w:szCs w:val="24"/>
+        </w:rPr>
+        <w:t xml:space="preserve">Certificado de Derecho de Uso</w:t>
+      </w:r>
+      <w:r>
+        <w:rPr>
+          <w:rFonts w:ascii="Times New Roman" w:cs="Times New Roman" w:eastAsia="Times New Roman" w:hAnsi="Times New Roman"/>
+          <w:b w:val="false"/>
+          <w:bCs w:val="false"/>
+          <w:i w:val="false"/>
+          <w:iCs w:val="false"/>
+          <w:color w:val="1A1A1A"/>
+          <w:sz w:val="24"/>
+          <w:szCs w:val="24"/>
+        </w:rPr>
+        <w:t xml:space="preserve"> expedido a su favor por el H. Ayuntamiento de Zacatecas, amparado con el </w:t>
+      </w:r>
+      <w:r>
+        <w:rPr>
+          <w:rFonts w:ascii="Times New Roman" w:cs="Times New Roman" w:eastAsia="Times New Roman" w:hAnsi="Times New Roman"/>
+          <w:b/>
+          <w:bCs/>
+          <w:i w:val="false"/>
+          <w:iCs w:val="false"/>
+          <w:color w:val="1A1A1A"/>
+          <w:sz w:val="24"/>
+          <w:szCs w:val="24"/>
+        </w:rPr>
+        <w:t xml:space="preserve">Recibo No. H 014013</w:t>
+      </w:r>
+      <w:r>
+        <w:rPr>
+          <w:rFonts w:ascii="Times New Roman" w:cs="Times New Roman" w:eastAsia="Times New Roman" w:hAnsi="Times New Roman"/>
+          <w:b w:val="false"/>
+          <w:bCs w:val="false"/>
+          <w:i w:val="false"/>
+          <w:iCs w:val="false"/>
+          <w:color w:val="1A1A1A"/>
+          <w:sz w:val="24"/>
+          <w:szCs w:val="24"/>
+        </w:rPr>
+        <w:t xml:space="preserve">, respecto de </w:t>
+      </w:r>
+      <w:r>
+        <w:rPr>
+          <w:rFonts w:ascii="Times New Roman" w:cs="Times New Roman" w:eastAsia="Times New Roman" w:hAnsi="Times New Roman"/>
+          <w:b/>
+          <w:bCs/>
+          <w:i w:val="false"/>
+          <w:iCs w:val="false"/>
+          <w:color w:val="1A1A1A"/>
+          <w:sz w:val="24"/>
+          <w:szCs w:val="24"/>
+        </w:rPr>
+        <w:t xml:space="preserve">dos gavetas ubicadas en el Nivel 4, gavetas números 15 y 16, del Panteón “Herrera”</w:t>
+      </w:r>
+      <w:r>
+        <w:rPr>
+          <w:rFonts w:ascii="Times New Roman" w:cs="Times New Roman" w:eastAsia="Times New Roman" w:hAnsi="Times New Roman"/>
+          <w:b w:val="false"/>
+          <w:bCs w:val="false"/>
+          <w:i w:val="false"/>
+          <w:iCs w:val="false"/>
+          <w:color w:val="1A1A1A"/>
+          <w:sz w:val="24"/>
+          <w:szCs w:val="24"/>
+        </w:rPr>
+        <w:t xml:space="preserve">, falleció el día ______ de ____________________ de __________, según consta en el acta de defunción que se acompaña al presente.</w:t>
       </w:r>
     </w:p>
     <w:p>
@@ -196,96 +335,89 @@
           <w:bCs w:val="false"/>
           <w:i w:val="false"/>
           <w:iCs w:val="false"/>
-          <w:caps w:val="false"/>
-          <w:color w:val="1A1A1A"/>
-          <w:sz w:val="24"/>
-          <w:szCs w:val="24"/>
-        </w:rPr>
-        <w:t xml:space="preserve">Manifiesto que soy titular del </w:t>
-      </w:r>
-      <w:r>
-        <w:rPr>
-          <w:rFonts w:ascii="Times New Roman" w:cs="Times New Roman" w:eastAsia="Times New Roman" w:hAnsi="Times New Roman"/>
-          <w:b/>
-          <w:bCs/>
-          <w:i w:val="false"/>
-          <w:iCs w:val="false"/>
-          <w:caps w:val="false"/>
-          <w:color w:val="1A1A1A"/>
-          <w:sz w:val="24"/>
-          <w:szCs w:val="24"/>
-        </w:rPr>
-        <w:t xml:space="preserve">Certificado de Derecho de Uso</w:t>
-      </w:r>
-      <w:r>
-        <w:rPr>
-          <w:rFonts w:ascii="Times New Roman" w:cs="Times New Roman" w:eastAsia="Times New Roman" w:hAnsi="Times New Roman"/>
-          <w:b w:val="false"/>
-          <w:bCs w:val="false"/>
-          <w:i w:val="false"/>
-          <w:iCs w:val="false"/>
-          <w:caps w:val="false"/>
-          <w:color w:val="1A1A1A"/>
-          <w:sz w:val="24"/>
-          <w:szCs w:val="24"/>
-        </w:rPr>
-        <w:t xml:space="preserve"> expedido a mi favor por el H. Ayuntamiento de Zacatecas, amparado con el </w:t>
-      </w:r>
-      <w:r>
-        <w:rPr>
-          <w:rFonts w:ascii="Times New Roman" w:cs="Times New Roman" w:eastAsia="Times New Roman" w:hAnsi="Times New Roman"/>
-          <w:b/>
-          <w:bCs/>
-          <w:i w:val="false"/>
-          <w:iCs w:val="false"/>
-          <w:caps w:val="false"/>
-          <w:color w:val="1A1A1A"/>
-          <w:sz w:val="24"/>
-          <w:szCs w:val="24"/>
-        </w:rPr>
-        <w:t xml:space="preserve">Recibo No. H 014013</w:t>
-      </w:r>
-      <w:r>
-        <w:rPr>
-          <w:rFonts w:ascii="Times New Roman" w:cs="Times New Roman" w:eastAsia="Times New Roman" w:hAnsi="Times New Roman"/>
-          <w:b w:val="false"/>
-          <w:bCs w:val="false"/>
-          <w:i w:val="false"/>
-          <w:iCs w:val="false"/>
-          <w:caps w:val="false"/>
-          <w:color w:val="1A1A1A"/>
-          <w:sz w:val="24"/>
-          <w:szCs w:val="24"/>
-        </w:rPr>
-        <w:t xml:space="preserve">, respecto de </w:t>
-      </w:r>
-      <w:r>
-        <w:rPr>
-          <w:rFonts w:ascii="Times New Roman" w:cs="Times New Roman" w:eastAsia="Times New Roman" w:hAnsi="Times New Roman"/>
-          <w:b/>
-          <w:bCs/>
-          <w:i w:val="false"/>
-          <w:iCs w:val="false"/>
-          <w:caps w:val="false"/>
-          <w:color w:val="1A1A1A"/>
-          <w:sz w:val="24"/>
-          <w:szCs w:val="24"/>
-        </w:rPr>
-        <w:t xml:space="preserve">dos gavetas ubicadas en el Nivel 4, gavetas números 15 y 16, del Panteón “Herrera”</w:t>
-      </w:r>
-      <w:r>
-        <w:rPr>
-          <w:rFonts w:ascii="Times New Roman" w:cs="Times New Roman" w:eastAsia="Times New Roman" w:hAnsi="Times New Roman"/>
-          <w:b w:val="false"/>
-          <w:bCs w:val="false"/>
-          <w:i w:val="false"/>
-          <w:iCs w:val="false"/>
-          <w:caps w:val="false"/>
-          <w:color w:val="1A1A1A"/>
-          <w:sz w:val="24"/>
-          <w:szCs w:val="24"/>
-        </w:rPr>
-        <w:t xml:space="preserve">, según consta en el certificado y plano correspondientes.</w:t>
+          <w:color w:val="1A1A1A"/>
+          <w:sz w:val="24"/>
+          <w:szCs w:val="24"/>
+        </w:rPr>
+        <w:t xml:space="preserve">En mi carácter de hija del titular, y contando con la conformidad de los demás familiares con derecho, por medio del presente escrito, de manera libre y voluntaria, </w:t>
+      </w:r>
+      <w:r>
+        <w:rPr>
+          <w:rFonts w:ascii="Times New Roman" w:cs="Times New Roman" w:eastAsia="Times New Roman" w:hAnsi="Times New Roman"/>
+          <w:b/>
+          <w:bCs/>
+          <w:i w:val="false"/>
+          <w:iCs w:val="false"/>
+          <w:color w:val="1A1A1A"/>
+          <w:sz w:val="24"/>
+          <w:szCs w:val="24"/>
+        </w:rPr>
+        <w:t xml:space="preserve">solicito y autorizo la cesión de la totalidad de los derechos de uso</w:t>
+      </w:r>
+      <w:r>
+        <w:rPr>
+          <w:rFonts w:ascii="Times New Roman" w:cs="Times New Roman" w:eastAsia="Times New Roman" w:hAnsi="Times New Roman"/>
+          <w:b w:val="false"/>
+          <w:bCs w:val="false"/>
+          <w:i w:val="false"/>
+          <w:iCs w:val="false"/>
+          <w:color w:val="1A1A1A"/>
+          <w:sz w:val="24"/>
+          <w:szCs w:val="24"/>
+        </w:rPr>
+        <w:t xml:space="preserve"> sobre las gavetas antes descritas a favor de la </w:t>
+      </w:r>
+      <w:r>
+        <w:rPr>
+          <w:rFonts w:ascii="Times New Roman" w:cs="Times New Roman" w:eastAsia="Times New Roman" w:hAnsi="Times New Roman"/>
+          <w:b/>
+          <w:bCs/>
+          <w:i w:val="false"/>
+          <w:iCs w:val="false"/>
+          <w:color w:val="1A1A1A"/>
+          <w:sz w:val="24"/>
+          <w:szCs w:val="24"/>
+        </w:rPr>
+        <w:t xml:space="preserve">C. Francisca Fernández Acuña</w:t>
+      </w:r>
+      <w:r>
+        <w:rPr>
+          <w:rFonts w:ascii="Times New Roman" w:cs="Times New Roman" w:eastAsia="Times New Roman" w:hAnsi="Times New Roman"/>
+          <w:b w:val="false"/>
+          <w:bCs w:val="false"/>
+          <w:i w:val="false"/>
+          <w:iCs w:val="false"/>
+          <w:color w:val="1A1A1A"/>
+          <w:sz w:val="24"/>
+          <w:szCs w:val="24"/>
+        </w:rPr>
+        <w:t xml:space="preserve">, quien en lo sucesivo será la única </w:t>
+      </w:r>
+      <w:r>
+        <w:rPr>
+          <w:rFonts w:ascii="Times New Roman" w:cs="Times New Roman" w:eastAsia="Times New Roman" w:hAnsi="Times New Roman"/>
+          <w:b/>
+          <w:bCs/>
+          <w:i w:val="false"/>
+          <w:iCs w:val="false"/>
+          <w:color w:val="1A1A1A"/>
+          <w:sz w:val="24"/>
+          <w:szCs w:val="24"/>
+        </w:rPr>
+        <w:t xml:space="preserve">beneficiaria y titular (cesionaria)</w:t>
+      </w:r>
+      <w:r>
+        <w:rPr>
+          <w:rFonts w:ascii="Times New Roman" w:cs="Times New Roman" w:eastAsia="Times New Roman" w:hAnsi="Times New Roman"/>
+          <w:b w:val="false"/>
+          <w:bCs w:val="false"/>
+          <w:i w:val="false"/>
+          <w:iCs w:val="false"/>
+          <w:color w:val="1A1A1A"/>
+          <w:sz w:val="24"/>
+          <w:szCs w:val="24"/>
+        </w:rPr>
+        <w:t xml:space="preserve"> de dichos derechos, con todos los derechos y obligaciones que de ello se derivan.</w:t>
       </w:r>
     </w:p>
     <w:p>
@@ -300,96 +432,156 @@
           <w:bCs w:val="false"/>
           <w:i w:val="false"/>
           <w:iCs w:val="false"/>
-          <w:caps w:val="false"/>
-          <w:color w:val="1A1A1A"/>
-          <w:sz w:val="24"/>
-          <w:szCs w:val="24"/>
-        </w:rPr>
-        <w:t xml:space="preserve">Por medio del presente escrito, de manera libre, voluntaria y sin reserva alguna, </w:t>
-      </w:r>
-      <w:r>
-        <w:rPr>
-          <w:rFonts w:ascii="Times New Roman" w:cs="Times New Roman" w:eastAsia="Times New Roman" w:hAnsi="Times New Roman"/>
-          <w:b/>
-          <w:bCs/>
-          <w:i w:val="false"/>
-          <w:iCs w:val="false"/>
-          <w:caps w:val="false"/>
-          <w:color w:val="1A1A1A"/>
-          <w:sz w:val="24"/>
-          <w:szCs w:val="24"/>
-        </w:rPr>
-        <w:t xml:space="preserve">cedo la totalidad de los derechos de uso</w:t>
-      </w:r>
-      <w:r>
-        <w:rPr>
-          <w:rFonts w:ascii="Times New Roman" w:cs="Times New Roman" w:eastAsia="Times New Roman" w:hAnsi="Times New Roman"/>
-          <w:b w:val="false"/>
-          <w:bCs w:val="false"/>
-          <w:i w:val="false"/>
-          <w:iCs w:val="false"/>
-          <w:caps w:val="false"/>
-          <w:color w:val="1A1A1A"/>
-          <w:sz w:val="24"/>
-          <w:szCs w:val="24"/>
-        </w:rPr>
-        <w:t xml:space="preserve"> que me corresponden sobre las gavetas antes descritas a favor de la </w:t>
-      </w:r>
-      <w:r>
-        <w:rPr>
-          <w:rFonts w:ascii="Times New Roman" w:cs="Times New Roman" w:eastAsia="Times New Roman" w:hAnsi="Times New Roman"/>
-          <w:b/>
-          <w:bCs/>
-          <w:i w:val="false"/>
-          <w:iCs w:val="false"/>
-          <w:caps w:val="false"/>
-          <w:color w:val="1A1A1A"/>
-          <w:sz w:val="24"/>
-          <w:szCs w:val="24"/>
-        </w:rPr>
-        <w:t xml:space="preserve">C. Francisca Fernández Acuña</w:t>
-      </w:r>
-      <w:r>
-        <w:rPr>
-          <w:rFonts w:ascii="Times New Roman" w:cs="Times New Roman" w:eastAsia="Times New Roman" w:hAnsi="Times New Roman"/>
-          <w:b w:val="false"/>
-          <w:bCs w:val="false"/>
-          <w:i w:val="false"/>
-          <w:iCs w:val="false"/>
-          <w:caps w:val="false"/>
-          <w:color w:val="1A1A1A"/>
-          <w:sz w:val="24"/>
-          <w:szCs w:val="24"/>
-        </w:rPr>
-        <w:t xml:space="preserve">, quien en lo sucesivo será la única </w:t>
-      </w:r>
-      <w:r>
-        <w:rPr>
-          <w:rFonts w:ascii="Times New Roman" w:cs="Times New Roman" w:eastAsia="Times New Roman" w:hAnsi="Times New Roman"/>
-          <w:b/>
-          <w:bCs/>
-          <w:i w:val="false"/>
-          <w:iCs w:val="false"/>
-          <w:caps w:val="false"/>
-          <w:color w:val="1A1A1A"/>
-          <w:sz w:val="24"/>
-          <w:szCs w:val="24"/>
-        </w:rPr>
-        <w:t xml:space="preserve">beneficiaria y titular (cesionaria)</w:t>
-      </w:r>
-      <w:r>
-        <w:rPr>
-          <w:rFonts w:ascii="Times New Roman" w:cs="Times New Roman" w:eastAsia="Times New Roman" w:hAnsi="Times New Roman"/>
-          <w:b w:val="false"/>
-          <w:bCs w:val="false"/>
-          <w:i w:val="false"/>
-          <w:iCs w:val="false"/>
-          <w:caps w:val="false"/>
-          <w:color w:val="1A1A1A"/>
-          <w:sz w:val="24"/>
-          <w:szCs w:val="24"/>
-        </w:rPr>
-        <w:t xml:space="preserve"> de los derechos de uso de dichas gavetas, con todos los derechos y obligaciones que de ello se derivan.</w:t>
+          <w:color w:val="1A1A1A"/>
+          <w:sz w:val="24"/>
+          <w:szCs w:val="24"/>
+        </w:rPr>
+        <w:t xml:space="preserve">Por lo anterior, solicito atentamente a esa Dirección a su digno cargo se sirva realizar los trámites administrativos correspondientes para que la presente </w:t>
+      </w:r>
+      <w:r>
+        <w:rPr>
+          <w:rFonts w:ascii="Times New Roman" w:cs="Times New Roman" w:eastAsia="Times New Roman" w:hAnsi="Times New Roman"/>
+          <w:b/>
+          <w:bCs/>
+          <w:i w:val="false"/>
+          <w:iCs w:val="false"/>
+          <w:color w:val="1A1A1A"/>
+          <w:sz w:val="24"/>
+          <w:szCs w:val="24"/>
+        </w:rPr>
+        <w:t xml:space="preserve">cesión de derechos</w:t>
+      </w:r>
+      <w:r>
+        <w:rPr>
+          <w:rFonts w:ascii="Times New Roman" w:cs="Times New Roman" w:eastAsia="Times New Roman" w:hAnsi="Times New Roman"/>
+          <w:b w:val="false"/>
+          <w:bCs w:val="false"/>
+          <w:i w:val="false"/>
+          <w:iCs w:val="false"/>
+          <w:color w:val="1A1A1A"/>
+          <w:sz w:val="24"/>
+          <w:szCs w:val="24"/>
+        </w:rPr>
+        <w:t xml:space="preserve"> quede debidamente registrada a nombre de la cesionaria y se expida a su favor la documentación que acredite la nueva titularidad.</w:t>
+      </w:r>
+    </w:p>
+    <w:p>
+      <w:pPr>
+        <w:spacing w:after="80" w:line="276"/>
+        <w:jc w:val="both"/>
+      </w:pPr>
+      <w:r>
+        <w:rPr>
+          <w:rFonts w:ascii="Times New Roman" w:cs="Times New Roman" w:eastAsia="Times New Roman" w:hAnsi="Times New Roman"/>
+          <w:b w:val="false"/>
+          <w:bCs w:val="false"/>
+          <w:i w:val="false"/>
+          <w:iCs w:val="false"/>
+          <w:color w:val="1A1A1A"/>
+          <w:sz w:val="24"/>
+          <w:szCs w:val="24"/>
+        </w:rPr>
+        <w:t xml:space="preserve">Para tal efecto, acompaño al presente los siguientes documentos:</w:t>
+      </w:r>
+    </w:p>
+    <w:p>
+      <w:pPr>
+        <w:spacing w:after="40" w:line="276"/>
+        <w:ind w:left="360"/>
+        <w:jc w:val="both"/>
+      </w:pPr>
+      <w:r>
+        <w:rPr>
+          <w:rFonts w:ascii="Times New Roman" w:cs="Times New Roman" w:eastAsia="Times New Roman" w:hAnsi="Times New Roman"/>
+          <w:b w:val="false"/>
+          <w:bCs w:val="false"/>
+          <w:i w:val="false"/>
+          <w:iCs w:val="false"/>
+          <w:color w:val="1A1A1A"/>
+          <w:sz w:val="24"/>
+          <w:szCs w:val="24"/>
+        </w:rPr>
+        <w:t xml:space="preserve">•  Acta de defunción del titular, C. Carlos Pérez Ramírez.</w:t>
+      </w:r>
+    </w:p>
+    <w:p>
+      <w:pPr>
+        <w:spacing w:after="40" w:line="276"/>
+        <w:ind w:left="360"/>
+        <w:jc w:val="both"/>
+      </w:pPr>
+      <w:r>
+        <w:rPr>
+          <w:rFonts w:ascii="Times New Roman" w:cs="Times New Roman" w:eastAsia="Times New Roman" w:hAnsi="Times New Roman"/>
+          <w:b w:val="false"/>
+          <w:bCs w:val="false"/>
+          <w:i w:val="false"/>
+          <w:iCs w:val="false"/>
+          <w:color w:val="1A1A1A"/>
+          <w:sz w:val="24"/>
+          <w:szCs w:val="24"/>
+        </w:rPr>
+        <w:t xml:space="preserve">•  Certificado de Derecho de Uso original y recibo No. H 014013.</w:t>
+      </w:r>
+    </w:p>
+    <w:p>
+      <w:pPr>
+        <w:spacing w:after="40" w:line="276"/>
+        <w:ind w:left="360"/>
+        <w:jc w:val="both"/>
+      </w:pPr>
+      <w:r>
+        <w:rPr>
+          <w:rFonts w:ascii="Times New Roman" w:cs="Times New Roman" w:eastAsia="Times New Roman" w:hAnsi="Times New Roman"/>
+          <w:b w:val="false"/>
+          <w:bCs w:val="false"/>
+          <w:i w:val="false"/>
+          <w:iCs w:val="false"/>
+          <w:color w:val="1A1A1A"/>
+          <w:sz w:val="24"/>
+          <w:szCs w:val="24"/>
+        </w:rPr>
+        <w:t xml:space="preserve">•  Identificación oficial (INE) de la suscrita.</w:t>
+      </w:r>
+    </w:p>
+    <w:p>
+      <w:pPr>
+        <w:spacing w:after="40" w:line="276"/>
+        <w:ind w:left="360"/>
+        <w:jc w:val="both"/>
+      </w:pPr>
+      <w:r>
+        <w:rPr>
+          <w:rFonts w:ascii="Times New Roman" w:cs="Times New Roman" w:eastAsia="Times New Roman" w:hAnsi="Times New Roman"/>
+          <w:b w:val="false"/>
+          <w:bCs w:val="false"/>
+          <w:i w:val="false"/>
+          <w:iCs w:val="false"/>
+          <w:color w:val="1A1A1A"/>
+          <w:sz w:val="24"/>
+          <w:szCs w:val="24"/>
+        </w:rPr>
+        <w:t xml:space="preserve">•  Identificación oficial (INE) de la cesionaria.</w:t>
+      </w:r>
+    </w:p>
+    <w:p>
+      <w:pPr>
+        <w:spacing w:after="240" w:line="276"/>
+        <w:ind w:left="360"/>
+        <w:jc w:val="both"/>
+      </w:pPr>
+      <w:r>
+        <w:rPr>
+          <w:rFonts w:ascii="Times New Roman" w:cs="Times New Roman" w:eastAsia="Times New Roman" w:hAnsi="Times New Roman"/>
+          <w:b w:val="false"/>
+          <w:bCs w:val="false"/>
+          <w:i w:val="false"/>
+          <w:iCs w:val="false"/>
+          <w:color w:val="1A1A1A"/>
+          <w:sz w:val="24"/>
+          <w:szCs w:val="24"/>
+        </w:rPr>
+        <w:t xml:space="preserve">•  Documento que acredita mi carácter de heredera (según corresponda).</w:t>
       </w:r>
     </w:p>
     <w:p>
@@ -404,60 +596,11 @@
           <w:bCs w:val="false"/>
           <w:i w:val="false"/>
           <w:iCs w:val="false"/>
-          <w:caps w:val="false"/>
-          <w:color w:val="1A1A1A"/>
-          <w:sz w:val="24"/>
-          <w:szCs w:val="24"/>
-        </w:rPr>
-        <w:t xml:space="preserve">En razón de lo anterior, solicito atentamente a esa Dirección a su digno cargo se sirva realizar los trámites administrativos correspondientes para que la presente </w:t>
-      </w:r>
-      <w:r>
-        <w:rPr>
-          <w:rFonts w:ascii="Times New Roman" w:cs="Times New Roman" w:eastAsia="Times New Roman" w:hAnsi="Times New Roman"/>
-          <w:b/>
-          <w:bCs/>
-          <w:i w:val="false"/>
-          <w:iCs w:val="false"/>
-          <w:caps w:val="false"/>
-          <w:color w:val="1A1A1A"/>
-          <w:sz w:val="24"/>
-          <w:szCs w:val="24"/>
-        </w:rPr>
-        <w:t xml:space="preserve">cesión de derechos</w:t>
-      </w:r>
-      <w:r>
-        <w:rPr>
-          <w:rFonts w:ascii="Times New Roman" w:cs="Times New Roman" w:eastAsia="Times New Roman" w:hAnsi="Times New Roman"/>
-          <w:b w:val="false"/>
-          <w:bCs w:val="false"/>
-          <w:i w:val="false"/>
-          <w:iCs w:val="false"/>
-          <w:caps w:val="false"/>
-          <w:color w:val="1A1A1A"/>
-          <w:sz w:val="24"/>
-          <w:szCs w:val="24"/>
-        </w:rPr>
-        <w:t xml:space="preserve"> quede debidamente registrada a nombre de la cesionaria y, en su caso, se expida a su favor la documentación que acredite la nueva titularidad.</w:t>
-      </w:r>
-    </w:p>
-    <w:p>
-      <w:pPr>
-        <w:spacing w:after="200" w:line="276"/>
-        <w:jc w:val="both"/>
-      </w:pPr>
-      <w:r>
-        <w:rPr>
-          <w:rFonts w:ascii="Times New Roman" w:cs="Times New Roman" w:eastAsia="Times New Roman" w:hAnsi="Times New Roman"/>
-          <w:b w:val="false"/>
-          <w:bCs w:val="false"/>
-          <w:i w:val="false"/>
-          <w:iCs w:val="false"/>
-          <w:caps w:val="false"/>
-          <w:color w:val="1A1A1A"/>
-          <w:sz w:val="24"/>
-          <w:szCs w:val="24"/>
-        </w:rPr>
-        <w:t xml:space="preserve">Asimismo, manifiesto bajo protesta de decir verdad que no existe impedimento legal alguno para llevar a cabo la presente cesión, y libero a esa Dirección de cualquier responsabilidad relacionada con la misma.</w:t>
+          <w:color w:val="1A1A1A"/>
+          <w:sz w:val="24"/>
+          <w:szCs w:val="24"/>
+        </w:rPr>
+        <w:t xml:space="preserve">Manifiesto bajo protesta de decir verdad que los datos aquí asentados son ciertos y que no existe impedimento legal alguno para llevar a cabo la presente cesión, liberando a esa Dirección de cualquier responsabilidad relacionada con la misma.</w:t>
       </w:r>
     </w:p>
     <w:p>
@@ -472,7 +615,6 @@
           <w:bCs w:val="false"/>
           <w:i w:val="false"/>
           <w:iCs w:val="false"/>
-          <w:caps w:val="false"/>
           <w:color w:val="1A1A1A"/>
           <w:sz w:val="24"/>
           <w:szCs w:val="24"/>
@@ -492,7 +634,6 @@
           <w:bCs/>
           <w:i w:val="false"/>
           <w:iCs w:val="false"/>
-          <w:caps w:val="false"/>
           <w:color w:val="1A1A1A"/>
           <w:sz w:val="24"/>
           <w:szCs w:val="24"/>
@@ -512,7 +653,6 @@
           <w:bCs w:val="false"/>
           <w:i w:val="false"/>
           <w:iCs w:val="false"/>
-          <w:caps w:val="false"/>
           <w:color w:val="1A1A1A"/>
           <w:sz w:val="24"/>
           <w:szCs w:val="24"/>
@@ -532,12 +672,11 @@
           <w:bCs/>
           <w:i w:val="false"/>
           <w:iCs w:val="false"/>
-          <w:caps w:val="false"/>
-          <w:color w:val="1A1A1A"/>
-          <w:sz w:val="24"/>
-          <w:szCs w:val="24"/>
-        </w:rPr>
-        <w:t xml:space="preserve">C. Carlos Pérez Ramírez</w:t>
+          <w:color w:val="1A1A1A"/>
+          <w:sz w:val="24"/>
+          <w:szCs w:val="24"/>
+        </w:rPr>
+        <w:t xml:space="preserve">C. Adriana Margarita Pérez Román</w:t>
       </w:r>
     </w:p>
     <w:p>
@@ -552,12 +691,11 @@
           <w:bCs w:val="false"/>
           <w:i w:val="false"/>
           <w:iCs w:val="false"/>
-          <w:caps w:val="false"/>
-          <w:color w:val="1A1A1A"/>
-          <w:sz w:val="24"/>
-          <w:szCs w:val="24"/>
-        </w:rPr>
-        <w:t xml:space="preserve">Cedente (titular actual)</w:t>
+          <w:color w:val="1A1A1A"/>
+          <w:sz w:val="24"/>
+          <w:szCs w:val="24"/>
+        </w:rPr>
+        <w:t xml:space="preserve">Solicitante — hija del finado titular (cedente)</w:t>
       </w:r>
     </w:p>
     <w:p>
@@ -572,7 +710,6 @@
           <w:bCs w:val="false"/>
           <w:i w:val="false"/>
           <w:iCs w:val="false"/>
-          <w:caps w:val="false"/>
           <w:color w:val="1A1A1A"/>
           <w:sz w:val="24"/>
           <w:szCs w:val="24"/>
@@ -592,7 +729,6 @@
           <w:bCs w:val="false"/>
           <w:i w:val="false"/>
           <w:iCs w:val="false"/>
-          <w:caps w:val="false"/>
           <w:color w:val="1A1A1A"/>
           <w:sz w:val="24"/>
           <w:szCs w:val="24"/>
@@ -612,7 +748,6 @@
           <w:bCs/>
           <w:i w:val="false"/>
           <w:iCs w:val="false"/>
-          <w:caps w:val="false"/>
           <w:color w:val="1A1A1A"/>
           <w:sz w:val="24"/>
           <w:szCs w:val="24"/>
@@ -632,7 +767,6 @@
           <w:bCs w:val="false"/>
           <w:i w:val="false"/>
           <w:iCs w:val="false"/>
-          <w:caps w:val="false"/>
           <w:color w:val="1A1A1A"/>
           <w:sz w:val="24"/>
           <w:szCs w:val="24"/>
@@ -652,7 +786,6 @@
           <w:bCs w:val="false"/>
           <w:i w:val="false"/>
           <w:iCs w:val="false"/>
-          <w:caps w:val="false"/>
           <w:color w:val="1A1A1A"/>
           <w:sz w:val="24"/>
           <w:szCs w:val="24"/>
@@ -672,7 +805,6 @@
           <w:bCs/>
           <w:i w:val="false"/>
           <w:iCs w:val="false"/>
-          <w:caps w:val="false"/>
           <w:color w:val="1A1A1A"/>
           <w:sz w:val="24"/>
           <w:szCs w:val="24"/>
@@ -692,7 +824,6 @@
           <w:bCs w:val="false"/>
           <w:i w:val="false"/>
           <w:iCs w:val="false"/>
-          <w:caps w:val="false"/>
           <w:color w:val="1A1A1A"/>
           <w:sz w:val="24"/>
           <w:szCs w:val="24"/>
@@ -712,7 +843,6 @@
           <w:bCs w:val="false"/>
           <w:i w:val="false"/>
           <w:iCs w:val="false"/>
-          <w:caps w:val="false"/>
           <w:color w:val="1A1A1A"/>
           <w:sz w:val="24"/>
           <w:szCs w:val="24"/>

</xml_diff>

<commit_message>
Carta de cesión: 8 herederos firmantes con representante común y ajuste de anexos
Co-Authored-By: Claude Opus 4.8 <noreply@anthropic.com>
Claude-Session: https://claude.ai/code/session_01Mmrn7JLAhSVspHUWxCQFPE
</commit_message>
<xml_diff>
--- a/Documentos/Carta_Cesion_Derechos_Gavetas.docx
+++ b/Documentos/Carta_Cesion_Derechos_Gavetas.docx
@@ -145,59 +145,33 @@
           <w:sz w:val="24"/>
           <w:szCs w:val="24"/>
         </w:rPr>
-        <w:t xml:space="preserve">La que suscribe, </w:t>
-      </w:r>
-      <w:r>
-        <w:rPr>
-          <w:rFonts w:ascii="Times New Roman" w:cs="Times New Roman" w:eastAsia="Times New Roman" w:hAnsi="Times New Roman"/>
-          <w:b/>
-          <w:bCs/>
-          <w:i w:val="false"/>
-          <w:iCs w:val="false"/>
-          <w:color w:val="1A1A1A"/>
-          <w:sz w:val="24"/>
-          <w:szCs w:val="24"/>
-        </w:rPr>
-        <w:t xml:space="preserve">C. Adriana Margarita Pérez Román</w:t>
-      </w:r>
-      <w:r>
-        <w:rPr>
-          <w:rFonts w:ascii="Times New Roman" w:cs="Times New Roman" w:eastAsia="Times New Roman" w:hAnsi="Times New Roman"/>
-          <w:b w:val="false"/>
-          <w:bCs w:val="false"/>
-          <w:i w:val="false"/>
-          <w:iCs w:val="false"/>
-          <w:color w:val="1A1A1A"/>
-          <w:sz w:val="24"/>
-          <w:szCs w:val="24"/>
-        </w:rPr>
-        <w:t xml:space="preserve">, con domicilio en ________________________________________________, por mi propio derecho y en mi carácter de </w:t>
-      </w:r>
-      <w:r>
-        <w:rPr>
-          <w:rFonts w:ascii="Times New Roman" w:cs="Times New Roman" w:eastAsia="Times New Roman" w:hAnsi="Times New Roman"/>
-          <w:b/>
-          <w:bCs/>
-          <w:i w:val="false"/>
-          <w:iCs w:val="false"/>
-          <w:color w:val="1A1A1A"/>
-          <w:sz w:val="24"/>
-          <w:szCs w:val="24"/>
-        </w:rPr>
-        <w:t xml:space="preserve">hija del finado señor Carlos Pérez Ramírez</w:t>
-      </w:r>
-      <w:r>
-        <w:rPr>
-          <w:rFonts w:ascii="Times New Roman" w:cs="Times New Roman" w:eastAsia="Times New Roman" w:hAnsi="Times New Roman"/>
-          <w:b w:val="false"/>
-          <w:bCs w:val="false"/>
-          <w:i w:val="false"/>
-          <w:iCs w:val="false"/>
-          <w:color w:val="1A1A1A"/>
-          <w:sz w:val="24"/>
-          <w:szCs w:val="24"/>
-        </w:rPr>
-        <w:t xml:space="preserve">, de la manera más atenta me dirijo a usted para exponer y solicitar lo siguiente:</w:t>
+        <w:t xml:space="preserve">Los que suscribimos, en nuestro carácter de </w:t>
+      </w:r>
+      <w:r>
+        <w:rPr>
+          <w:rFonts w:ascii="Times New Roman" w:cs="Times New Roman" w:eastAsia="Times New Roman" w:hAnsi="Times New Roman"/>
+          <w:b/>
+          <w:bCs/>
+          <w:i w:val="false"/>
+          <w:iCs w:val="false"/>
+          <w:color w:val="1A1A1A"/>
+          <w:sz w:val="24"/>
+          <w:szCs w:val="24"/>
+        </w:rPr>
+        <w:t xml:space="preserve">herederos y beneficiarios del finado señor Carlos Pérez Ramírez</w:t>
+      </w:r>
+      <w:r>
+        <w:rPr>
+          <w:rFonts w:ascii="Times New Roman" w:cs="Times New Roman" w:eastAsia="Times New Roman" w:hAnsi="Times New Roman"/>
+          <w:b w:val="false"/>
+          <w:bCs w:val="false"/>
+          <w:i w:val="false"/>
+          <w:iCs w:val="false"/>
+          <w:color w:val="1A1A1A"/>
+          <w:sz w:val="24"/>
+          <w:szCs w:val="24"/>
+        </w:rPr>
+        <w:t xml:space="preserve">, y señalando como domicilio para oír y recibir notificaciones el ubicado en ______________________________________________, por nuestro propio derecho nos dirigimos a usted para exponer y solicitar lo siguiente:</w:t>
       </w:r>
     </w:p>
     <w:p>
@@ -216,7 +190,7 @@
           <w:sz w:val="24"/>
           <w:szCs w:val="24"/>
         </w:rPr>
-        <w:t xml:space="preserve">Que mi señor padre, el </w:t>
+        <w:t xml:space="preserve">Que nuestro señor padre, el </w:t>
       </w:r>
       <w:r>
         <w:rPr>
@@ -339,33 +313,59 @@
           <w:sz w:val="24"/>
           <w:szCs w:val="24"/>
         </w:rPr>
-        <w:t xml:space="preserve">En mi carácter de hija del titular, y contando con la conformidad de los demás familiares con derecho, por medio del presente escrito, de manera libre y voluntaria, </w:t>
-      </w:r>
-      <w:r>
-        <w:rPr>
-          <w:rFonts w:ascii="Times New Roman" w:cs="Times New Roman" w:eastAsia="Times New Roman" w:hAnsi="Times New Roman"/>
-          <w:b/>
-          <w:bCs/>
-          <w:i w:val="false"/>
-          <w:iCs w:val="false"/>
-          <w:color w:val="1A1A1A"/>
-          <w:sz w:val="24"/>
-          <w:szCs w:val="24"/>
-        </w:rPr>
-        <w:t xml:space="preserve">solicito y autorizo la cesión de la totalidad de los derechos de uso</w:t>
-      </w:r>
-      <w:r>
-        <w:rPr>
-          <w:rFonts w:ascii="Times New Roman" w:cs="Times New Roman" w:eastAsia="Times New Roman" w:hAnsi="Times New Roman"/>
-          <w:b w:val="false"/>
-          <w:bCs w:val="false"/>
-          <w:i w:val="false"/>
-          <w:iCs w:val="false"/>
-          <w:color w:val="1A1A1A"/>
-          <w:sz w:val="24"/>
-          <w:szCs w:val="24"/>
-        </w:rPr>
-        <w:t xml:space="preserve"> sobre las gavetas antes descritas a favor de la </w:t>
+        <w:t xml:space="preserve">Que somos </w:t>
+      </w:r>
+      <w:r>
+        <w:rPr>
+          <w:rFonts w:ascii="Times New Roman" w:cs="Times New Roman" w:eastAsia="Times New Roman" w:hAnsi="Times New Roman"/>
+          <w:b/>
+          <w:bCs/>
+          <w:i w:val="false"/>
+          <w:iCs w:val="false"/>
+          <w:color w:val="1A1A1A"/>
+          <w:sz w:val="24"/>
+          <w:szCs w:val="24"/>
+        </w:rPr>
+        <w:t xml:space="preserve">ocho (8) los herederos y beneficiarios</w:t>
+      </w:r>
+      <w:r>
+        <w:rPr>
+          <w:rFonts w:ascii="Times New Roman" w:cs="Times New Roman" w:eastAsia="Times New Roman" w:hAnsi="Times New Roman"/>
+          <w:b w:val="false"/>
+          <w:bCs w:val="false"/>
+          <w:i w:val="false"/>
+          <w:iCs w:val="false"/>
+          <w:color w:val="1A1A1A"/>
+          <w:sz w:val="24"/>
+          <w:szCs w:val="24"/>
+        </w:rPr>
+        <w:t xml:space="preserve"> con derecho respecto de dichas gavetas, y que de común acuerdo, de manera libre y voluntaria, los abajo firmantes </w:t>
+      </w:r>
+      <w:r>
+        <w:rPr>
+          <w:rFonts w:ascii="Times New Roman" w:cs="Times New Roman" w:eastAsia="Times New Roman" w:hAnsi="Times New Roman"/>
+          <w:b/>
+          <w:bCs/>
+          <w:i w:val="false"/>
+          <w:iCs w:val="false"/>
+          <w:color w:val="1A1A1A"/>
+          <w:sz w:val="24"/>
+          <w:szCs w:val="24"/>
+        </w:rPr>
+        <w:t xml:space="preserve">cedemos la totalidad de los derechos de uso</w:t>
+      </w:r>
+      <w:r>
+        <w:rPr>
+          <w:rFonts w:ascii="Times New Roman" w:cs="Times New Roman" w:eastAsia="Times New Roman" w:hAnsi="Times New Roman"/>
+          <w:b w:val="false"/>
+          <w:bCs w:val="false"/>
+          <w:i w:val="false"/>
+          <w:iCs w:val="false"/>
+          <w:color w:val="1A1A1A"/>
+          <w:sz w:val="24"/>
+          <w:szCs w:val="24"/>
+        </w:rPr>
+        <w:t xml:space="preserve"> que nos corresponden sobre las gavetas antes descritas a favor de la </w:t>
       </w:r>
       <w:r>
         <w:rPr>
@@ -436,7 +436,59 @@
           <w:sz w:val="24"/>
           <w:szCs w:val="24"/>
         </w:rPr>
-        <w:t xml:space="preserve">Por lo anterior, solicito atentamente a esa Dirección a su digno cargo se sirva realizar los trámites administrativos correspondientes para que la presente </w:t>
+        <w:t xml:space="preserve">Para el seguimiento y firma del presente trámite, designamos como </w:t>
+      </w:r>
+      <w:r>
+        <w:rPr>
+          <w:rFonts w:ascii="Times New Roman" w:cs="Times New Roman" w:eastAsia="Times New Roman" w:hAnsi="Times New Roman"/>
+          <w:b/>
+          <w:bCs/>
+          <w:i w:val="false"/>
+          <w:iCs w:val="false"/>
+          <w:color w:val="1A1A1A"/>
+          <w:sz w:val="24"/>
+          <w:szCs w:val="24"/>
+        </w:rPr>
+        <w:t xml:space="preserve">representante común</w:t>
+      </w:r>
+      <w:r>
+        <w:rPr>
+          <w:rFonts w:ascii="Times New Roman" w:cs="Times New Roman" w:eastAsia="Times New Roman" w:hAnsi="Times New Roman"/>
+          <w:b w:val="false"/>
+          <w:bCs w:val="false"/>
+          <w:i w:val="false"/>
+          <w:iCs w:val="false"/>
+          <w:color w:val="1A1A1A"/>
+          <w:sz w:val="24"/>
+          <w:szCs w:val="24"/>
+        </w:rPr>
+        <w:t xml:space="preserve"> a la </w:t>
+      </w:r>
+      <w:r>
+        <w:rPr>
+          <w:rFonts w:ascii="Times New Roman" w:cs="Times New Roman" w:eastAsia="Times New Roman" w:hAnsi="Times New Roman"/>
+          <w:b/>
+          <w:bCs/>
+          <w:i w:val="false"/>
+          <w:iCs w:val="false"/>
+          <w:color w:val="1A1A1A"/>
+          <w:sz w:val="24"/>
+          <w:szCs w:val="24"/>
+        </w:rPr>
+        <w:t xml:space="preserve">C. Adriana Margarita Pérez Román</w:t>
+      </w:r>
+      <w:r>
+        <w:rPr>
+          <w:rFonts w:ascii="Times New Roman" w:cs="Times New Roman" w:eastAsia="Times New Roman" w:hAnsi="Times New Roman"/>
+          <w:b w:val="false"/>
+          <w:bCs w:val="false"/>
+          <w:i w:val="false"/>
+          <w:iCs w:val="false"/>
+          <w:color w:val="1A1A1A"/>
+          <w:sz w:val="24"/>
+          <w:szCs w:val="24"/>
+        </w:rPr>
+        <w:t xml:space="preserve">. En razón de lo anterior, solicitamos atentamente a esa Dirección a su digno cargo se sirva realizar los trámites administrativos correspondientes para que la presente </w:t>
       </w:r>
       <w:r>
         <w:rPr>
@@ -481,7 +533,7 @@
           <w:sz w:val="24"/>
           <w:szCs w:val="24"/>
         </w:rPr>
-        <w:t xml:space="preserve">Para tal efecto, acompaño al presente los siguientes documentos:</w:t>
+        <w:t xml:space="preserve">Para tal efecto, acompañamos al presente los siguientes documentos:</w:t>
       </w:r>
     </w:p>
     <w:p>
@@ -541,7 +593,7 @@
           <w:sz w:val="24"/>
           <w:szCs w:val="24"/>
         </w:rPr>
-        <w:t xml:space="preserve">•  Identificación oficial (INE) de la suscrita.</w:t>
+        <w:t xml:space="preserve">•  Identificaciones oficiales (INE) de los ocho herederos y beneficiarios que suscriben.</w:t>
       </w:r>
     </w:p>
     <w:p>
@@ -581,7 +633,7 @@
           <w:sz w:val="24"/>
           <w:szCs w:val="24"/>
         </w:rPr>
-        <w:t xml:space="preserve">•  Documento que acredita mi carácter de heredera (según corresponda).</w:t>
+        <w:t xml:space="preserve">•  Documento que acredita el carácter de herederos (según corresponda).</w:t>
       </w:r>
     </w:p>
     <w:p>
@@ -600,12 +652,12 @@
           <w:sz w:val="24"/>
           <w:szCs w:val="24"/>
         </w:rPr>
-        <w:t xml:space="preserve">Manifiesto bajo protesta de decir verdad que los datos aquí asentados son ciertos y que no existe impedimento legal alguno para llevar a cabo la presente cesión, liberando a esa Dirección de cualquier responsabilidad relacionada con la misma.</w:t>
-      </w:r>
-    </w:p>
-    <w:p>
-      <w:pPr>
-        <w:spacing w:after="520" w:line="276"/>
+        <w:t xml:space="preserve">Manifestamos bajo protesta de decir verdad que los datos aquí asentados son ciertos, que somos la totalidad de los beneficiarios con derecho y que no existe impedimento legal alguno para llevar a cabo la presente cesión, liberando a esa Dirección de cualquier responsabilidad relacionada con la misma.</w:t>
+      </w:r>
+    </w:p>
+    <w:p>
+      <w:pPr>
+        <w:spacing w:after="420" w:line="276"/>
         <w:jc w:val="both"/>
       </w:pPr>
       <w:r>
@@ -619,12 +671,12 @@
           <w:sz w:val="24"/>
           <w:szCs w:val="24"/>
         </w:rPr>
-        <w:t xml:space="preserve">Sin otro particular, agradezco de antemano la atención brindada y quedo a sus órdenes para cualquier aclaración o requisito adicional.</w:t>
-      </w:r>
-    </w:p>
-    <w:p>
-      <w:pPr>
-        <w:spacing w:after="640" w:line="276"/>
+        <w:t xml:space="preserve">Sin otro particular, agradecemos de antemano la atención brindada y quedamos a sus órdenes para cualquier aclaración o requisito adicional.</w:t>
+      </w:r>
+    </w:p>
+    <w:p>
+      <w:pPr>
+        <w:spacing w:after="120" w:line="276"/>
         <w:jc w:val="center"/>
       </w:pPr>
       <w:r>
@@ -643,26 +695,766 @@
     </w:p>
     <w:p>
       <w:pPr>
-        <w:spacing w:after="0" w:line="276"/>
+        <w:spacing w:after="200" w:line="276"/>
         <w:jc w:val="center"/>
       </w:pPr>
       <w:r>
         <w:rPr>
           <w:rFonts w:ascii="Times New Roman" w:cs="Times New Roman" w:eastAsia="Times New Roman" w:hAnsi="Times New Roman"/>
-          <w:b w:val="false"/>
-          <w:bCs w:val="false"/>
-          <w:i w:val="false"/>
-          <w:iCs w:val="false"/>
-          <w:color w:val="1A1A1A"/>
-          <w:sz w:val="24"/>
-          <w:szCs w:val="24"/>
-        </w:rPr>
-        <w:t xml:space="preserve">_______________________________________</w:t>
-      </w:r>
-    </w:p>
-    <w:p>
-      <w:pPr>
-        <w:spacing w:after="0" w:line="276"/>
+          <w:b/>
+          <w:bCs/>
+          <w:i w:val="false"/>
+          <w:iCs w:val="false"/>
+          <w:color w:val="1A1A1A"/>
+          <w:sz w:val="24"/>
+          <w:szCs w:val="24"/>
+        </w:rPr>
+        <w:t xml:space="preserve">LOS HEREDEROS Y BENEFICIARIOS (CEDENTES)</w:t>
+      </w:r>
+    </w:p>
+    <w:tbl>
+      <w:tblPr>
+        <w:tblW w:type="dxa" w:w="9360"/>
+        <w:tblBorders>
+          <w:top w:val="none"/>
+          <w:left w:val="none"/>
+          <w:bottom w:val="none"/>
+          <w:right w:val="none"/>
+          <w:insideH w:val="none"/>
+          <w:insideV w:val="none"/>
+        </w:tblBorders>
+      </w:tblPr>
+      <w:tblGrid>
+        <w:gridCol w:w="4680"/>
+        <w:gridCol w:w="4680"/>
+      </w:tblGrid>
+      <w:tr>
+        <w:tc>
+          <w:tcPr>
+            <w:tcW w:type="dxa" w:w="4680"/>
+            <w:tcMar>
+              <w:top w:type="dxa" w:w="60"/>
+              <w:left w:type="dxa" w:w="120"/>
+              <w:bottom w:type="dxa" w:w="220"/>
+              <w:right w:type="dxa" w:w="120"/>
+            </w:tcMar>
+          </w:tcPr>
+          <w:p>
+            <w:pPr>
+              <w:spacing w:after="160"/>
+              <w:jc w:val="center"/>
+            </w:pPr>
+            <w:r>
+              <w:rPr>
+                <w:rFonts w:ascii="Times New Roman" w:cs="Times New Roman" w:eastAsia="Times New Roman" w:hAnsi="Times New Roman"/>
+                <w:b w:val="false"/>
+                <w:bCs w:val="false"/>
+                <w:i w:val="false"/>
+                <w:iCs w:val="false"/>
+                <w:color w:val="1A1A1A"/>
+                <w:sz w:val="24"/>
+                <w:szCs w:val="24"/>
+              </w:rPr>
+              <w:t xml:space="preserve"/>
+            </w:r>
+          </w:p>
+          <w:p>
+            <w:pPr>
+              <w:spacing w:after="0"/>
+              <w:jc w:val="center"/>
+            </w:pPr>
+            <w:r>
+              <w:rPr>
+                <w:rFonts w:ascii="Times New Roman" w:cs="Times New Roman" w:eastAsia="Times New Roman" w:hAnsi="Times New Roman"/>
+                <w:b w:val="false"/>
+                <w:bCs w:val="false"/>
+                <w:i w:val="false"/>
+                <w:iCs w:val="false"/>
+                <w:color w:val="1A1A1A"/>
+                <w:sz w:val="24"/>
+                <w:szCs w:val="24"/>
+              </w:rPr>
+              <w:t xml:space="preserve">____________________________________</w:t>
+            </w:r>
+          </w:p>
+          <w:p>
+            <w:pPr>
+              <w:spacing w:after="0"/>
+              <w:jc w:val="center"/>
+            </w:pPr>
+            <w:r>
+              <w:rPr>
+                <w:rFonts w:ascii="Times New Roman" w:cs="Times New Roman" w:eastAsia="Times New Roman" w:hAnsi="Times New Roman"/>
+                <w:b/>
+                <w:bCs/>
+                <w:i w:val="false"/>
+                <w:iCs w:val="false"/>
+                <w:color w:val="1A1A1A"/>
+                <w:sz w:val="24"/>
+                <w:szCs w:val="24"/>
+              </w:rPr>
+              <w:t xml:space="preserve">C. Adriana Margarita Pérez Román</w:t>
+            </w:r>
+          </w:p>
+          <w:p>
+            <w:pPr>
+              <w:spacing w:after="0"/>
+              <w:jc w:val="center"/>
+            </w:pPr>
+            <w:r>
+              <w:rPr>
+                <w:rFonts w:ascii="Times New Roman" w:cs="Times New Roman" w:eastAsia="Times New Roman" w:hAnsi="Times New Roman"/>
+                <w:b w:val="false"/>
+                <w:bCs w:val="false"/>
+                <w:i/>
+                <w:iCs/>
+                <w:color w:val="1A1A1A"/>
+                <w:sz w:val="24"/>
+                <w:szCs w:val="24"/>
+              </w:rPr>
+              <w:t xml:space="preserve">Heredera y representante común</w:t>
+            </w:r>
+          </w:p>
+        </w:tc>
+        <w:tc>
+          <w:tcPr>
+            <w:tcW w:type="dxa" w:w="4680"/>
+            <w:tcMar>
+              <w:top w:type="dxa" w:w="60"/>
+              <w:left w:type="dxa" w:w="120"/>
+              <w:bottom w:type="dxa" w:w="220"/>
+              <w:right w:type="dxa" w:w="120"/>
+            </w:tcMar>
+          </w:tcPr>
+          <w:p>
+            <w:pPr>
+              <w:spacing w:after="160"/>
+              <w:jc w:val="center"/>
+            </w:pPr>
+            <w:r>
+              <w:rPr>
+                <w:rFonts w:ascii="Times New Roman" w:cs="Times New Roman" w:eastAsia="Times New Roman" w:hAnsi="Times New Roman"/>
+                <w:b w:val="false"/>
+                <w:bCs w:val="false"/>
+                <w:i w:val="false"/>
+                <w:iCs w:val="false"/>
+                <w:color w:val="1A1A1A"/>
+                <w:sz w:val="24"/>
+                <w:szCs w:val="24"/>
+              </w:rPr>
+              <w:t xml:space="preserve"/>
+            </w:r>
+          </w:p>
+          <w:p>
+            <w:pPr>
+              <w:spacing w:after="0"/>
+              <w:jc w:val="center"/>
+            </w:pPr>
+            <w:r>
+              <w:rPr>
+                <w:rFonts w:ascii="Times New Roman" w:cs="Times New Roman" w:eastAsia="Times New Roman" w:hAnsi="Times New Roman"/>
+                <w:b w:val="false"/>
+                <w:bCs w:val="false"/>
+                <w:i w:val="false"/>
+                <w:iCs w:val="false"/>
+                <w:color w:val="1A1A1A"/>
+                <w:sz w:val="24"/>
+                <w:szCs w:val="24"/>
+              </w:rPr>
+              <w:t xml:space="preserve">____________________________________</w:t>
+            </w:r>
+          </w:p>
+          <w:p>
+            <w:pPr>
+              <w:spacing w:after="0"/>
+              <w:jc w:val="center"/>
+            </w:pPr>
+            <w:r>
+              <w:rPr>
+                <w:rFonts w:ascii="Times New Roman" w:cs="Times New Roman" w:eastAsia="Times New Roman" w:hAnsi="Times New Roman"/>
+                <w:b w:val="false"/>
+                <w:bCs w:val="false"/>
+                <w:i w:val="false"/>
+                <w:iCs w:val="false"/>
+                <w:color w:val="1A1A1A"/>
+                <w:sz w:val="24"/>
+                <w:szCs w:val="24"/>
+              </w:rPr>
+              <w:t xml:space="preserve">Nombre: ____________________________</w:t>
+            </w:r>
+          </w:p>
+          <w:p>
+            <w:pPr>
+              <w:spacing w:after="0"/>
+              <w:jc w:val="center"/>
+            </w:pPr>
+            <w:r>
+              <w:rPr>
+                <w:rFonts w:ascii="Times New Roman" w:cs="Times New Roman" w:eastAsia="Times New Roman" w:hAnsi="Times New Roman"/>
+                <w:b w:val="false"/>
+                <w:bCs w:val="false"/>
+                <w:i/>
+                <w:iCs/>
+                <w:color w:val="1A1A1A"/>
+                <w:sz w:val="24"/>
+                <w:szCs w:val="24"/>
+              </w:rPr>
+              <w:t xml:space="preserve">Heredero(a) / beneficiario(a)</w:t>
+            </w:r>
+          </w:p>
+        </w:tc>
+      </w:tr>
+      <w:tr>
+        <w:tc>
+          <w:tcPr>
+            <w:tcW w:type="dxa" w:w="4680"/>
+            <w:tcMar>
+              <w:top w:type="dxa" w:w="60"/>
+              <w:left w:type="dxa" w:w="120"/>
+              <w:bottom w:type="dxa" w:w="220"/>
+              <w:right w:type="dxa" w:w="120"/>
+            </w:tcMar>
+          </w:tcPr>
+          <w:p>
+            <w:pPr>
+              <w:spacing w:after="160"/>
+              <w:jc w:val="center"/>
+            </w:pPr>
+            <w:r>
+              <w:rPr>
+                <w:rFonts w:ascii="Times New Roman" w:cs="Times New Roman" w:eastAsia="Times New Roman" w:hAnsi="Times New Roman"/>
+                <w:b w:val="false"/>
+                <w:bCs w:val="false"/>
+                <w:i w:val="false"/>
+                <w:iCs w:val="false"/>
+                <w:color w:val="1A1A1A"/>
+                <w:sz w:val="24"/>
+                <w:szCs w:val="24"/>
+              </w:rPr>
+              <w:t xml:space="preserve"/>
+            </w:r>
+          </w:p>
+          <w:p>
+            <w:pPr>
+              <w:spacing w:after="0"/>
+              <w:jc w:val="center"/>
+            </w:pPr>
+            <w:r>
+              <w:rPr>
+                <w:rFonts w:ascii="Times New Roman" w:cs="Times New Roman" w:eastAsia="Times New Roman" w:hAnsi="Times New Roman"/>
+                <w:b w:val="false"/>
+                <w:bCs w:val="false"/>
+                <w:i w:val="false"/>
+                <w:iCs w:val="false"/>
+                <w:color w:val="1A1A1A"/>
+                <w:sz w:val="24"/>
+                <w:szCs w:val="24"/>
+              </w:rPr>
+              <w:t xml:space="preserve">____________________________________</w:t>
+            </w:r>
+          </w:p>
+          <w:p>
+            <w:pPr>
+              <w:spacing w:after="0"/>
+              <w:jc w:val="center"/>
+            </w:pPr>
+            <w:r>
+              <w:rPr>
+                <w:rFonts w:ascii="Times New Roman" w:cs="Times New Roman" w:eastAsia="Times New Roman" w:hAnsi="Times New Roman"/>
+                <w:b w:val="false"/>
+                <w:bCs w:val="false"/>
+                <w:i w:val="false"/>
+                <w:iCs w:val="false"/>
+                <w:color w:val="1A1A1A"/>
+                <w:sz w:val="24"/>
+                <w:szCs w:val="24"/>
+              </w:rPr>
+              <w:t xml:space="preserve">Nombre: ____________________________</w:t>
+            </w:r>
+          </w:p>
+          <w:p>
+            <w:pPr>
+              <w:spacing w:after="0"/>
+              <w:jc w:val="center"/>
+            </w:pPr>
+            <w:r>
+              <w:rPr>
+                <w:rFonts w:ascii="Times New Roman" w:cs="Times New Roman" w:eastAsia="Times New Roman" w:hAnsi="Times New Roman"/>
+                <w:b w:val="false"/>
+                <w:bCs w:val="false"/>
+                <w:i/>
+                <w:iCs/>
+                <w:color w:val="1A1A1A"/>
+                <w:sz w:val="24"/>
+                <w:szCs w:val="24"/>
+              </w:rPr>
+              <w:t xml:space="preserve">Heredero(a) / beneficiario(a)</w:t>
+            </w:r>
+          </w:p>
+        </w:tc>
+        <w:tc>
+          <w:tcPr>
+            <w:tcW w:type="dxa" w:w="4680"/>
+            <w:tcMar>
+              <w:top w:type="dxa" w:w="60"/>
+              <w:left w:type="dxa" w:w="120"/>
+              <w:bottom w:type="dxa" w:w="220"/>
+              <w:right w:type="dxa" w:w="120"/>
+            </w:tcMar>
+          </w:tcPr>
+          <w:p>
+            <w:pPr>
+              <w:spacing w:after="160"/>
+              <w:jc w:val="center"/>
+            </w:pPr>
+            <w:r>
+              <w:rPr>
+                <w:rFonts w:ascii="Times New Roman" w:cs="Times New Roman" w:eastAsia="Times New Roman" w:hAnsi="Times New Roman"/>
+                <w:b w:val="false"/>
+                <w:bCs w:val="false"/>
+                <w:i w:val="false"/>
+                <w:iCs w:val="false"/>
+                <w:color w:val="1A1A1A"/>
+                <w:sz w:val="24"/>
+                <w:szCs w:val="24"/>
+              </w:rPr>
+              <w:t xml:space="preserve"/>
+            </w:r>
+          </w:p>
+          <w:p>
+            <w:pPr>
+              <w:spacing w:after="0"/>
+              <w:jc w:val="center"/>
+            </w:pPr>
+            <w:r>
+              <w:rPr>
+                <w:rFonts w:ascii="Times New Roman" w:cs="Times New Roman" w:eastAsia="Times New Roman" w:hAnsi="Times New Roman"/>
+                <w:b w:val="false"/>
+                <w:bCs w:val="false"/>
+                <w:i w:val="false"/>
+                <w:iCs w:val="false"/>
+                <w:color w:val="1A1A1A"/>
+                <w:sz w:val="24"/>
+                <w:szCs w:val="24"/>
+              </w:rPr>
+              <w:t xml:space="preserve">____________________________________</w:t>
+            </w:r>
+          </w:p>
+          <w:p>
+            <w:pPr>
+              <w:spacing w:after="0"/>
+              <w:jc w:val="center"/>
+            </w:pPr>
+            <w:r>
+              <w:rPr>
+                <w:rFonts w:ascii="Times New Roman" w:cs="Times New Roman" w:eastAsia="Times New Roman" w:hAnsi="Times New Roman"/>
+                <w:b w:val="false"/>
+                <w:bCs w:val="false"/>
+                <w:i w:val="false"/>
+                <w:iCs w:val="false"/>
+                <w:color w:val="1A1A1A"/>
+                <w:sz w:val="24"/>
+                <w:szCs w:val="24"/>
+              </w:rPr>
+              <w:t xml:space="preserve">Nombre: ____________________________</w:t>
+            </w:r>
+          </w:p>
+          <w:p>
+            <w:pPr>
+              <w:spacing w:after="0"/>
+              <w:jc w:val="center"/>
+            </w:pPr>
+            <w:r>
+              <w:rPr>
+                <w:rFonts w:ascii="Times New Roman" w:cs="Times New Roman" w:eastAsia="Times New Roman" w:hAnsi="Times New Roman"/>
+                <w:b w:val="false"/>
+                <w:bCs w:val="false"/>
+                <w:i/>
+                <w:iCs/>
+                <w:color w:val="1A1A1A"/>
+                <w:sz w:val="24"/>
+                <w:szCs w:val="24"/>
+              </w:rPr>
+              <w:t xml:space="preserve">Heredero(a) / beneficiario(a)</w:t>
+            </w:r>
+          </w:p>
+        </w:tc>
+      </w:tr>
+      <w:tr>
+        <w:tc>
+          <w:tcPr>
+            <w:tcW w:type="dxa" w:w="4680"/>
+            <w:tcMar>
+              <w:top w:type="dxa" w:w="60"/>
+              <w:left w:type="dxa" w:w="120"/>
+              <w:bottom w:type="dxa" w:w="220"/>
+              <w:right w:type="dxa" w:w="120"/>
+            </w:tcMar>
+          </w:tcPr>
+          <w:p>
+            <w:pPr>
+              <w:spacing w:after="160"/>
+              <w:jc w:val="center"/>
+            </w:pPr>
+            <w:r>
+              <w:rPr>
+                <w:rFonts w:ascii="Times New Roman" w:cs="Times New Roman" w:eastAsia="Times New Roman" w:hAnsi="Times New Roman"/>
+                <w:b w:val="false"/>
+                <w:bCs w:val="false"/>
+                <w:i w:val="false"/>
+                <w:iCs w:val="false"/>
+                <w:color w:val="1A1A1A"/>
+                <w:sz w:val="24"/>
+                <w:szCs w:val="24"/>
+              </w:rPr>
+              <w:t xml:space="preserve"/>
+            </w:r>
+          </w:p>
+          <w:p>
+            <w:pPr>
+              <w:spacing w:after="0"/>
+              <w:jc w:val="center"/>
+            </w:pPr>
+            <w:r>
+              <w:rPr>
+                <w:rFonts w:ascii="Times New Roman" w:cs="Times New Roman" w:eastAsia="Times New Roman" w:hAnsi="Times New Roman"/>
+                <w:b w:val="false"/>
+                <w:bCs w:val="false"/>
+                <w:i w:val="false"/>
+                <w:iCs w:val="false"/>
+                <w:color w:val="1A1A1A"/>
+                <w:sz w:val="24"/>
+                <w:szCs w:val="24"/>
+              </w:rPr>
+              <w:t xml:space="preserve">____________________________________</w:t>
+            </w:r>
+          </w:p>
+          <w:p>
+            <w:pPr>
+              <w:spacing w:after="0"/>
+              <w:jc w:val="center"/>
+            </w:pPr>
+            <w:r>
+              <w:rPr>
+                <w:rFonts w:ascii="Times New Roman" w:cs="Times New Roman" w:eastAsia="Times New Roman" w:hAnsi="Times New Roman"/>
+                <w:b w:val="false"/>
+                <w:bCs w:val="false"/>
+                <w:i w:val="false"/>
+                <w:iCs w:val="false"/>
+                <w:color w:val="1A1A1A"/>
+                <w:sz w:val="24"/>
+                <w:szCs w:val="24"/>
+              </w:rPr>
+              <w:t xml:space="preserve">Nombre: ____________________________</w:t>
+            </w:r>
+          </w:p>
+          <w:p>
+            <w:pPr>
+              <w:spacing w:after="0"/>
+              <w:jc w:val="center"/>
+            </w:pPr>
+            <w:r>
+              <w:rPr>
+                <w:rFonts w:ascii="Times New Roman" w:cs="Times New Roman" w:eastAsia="Times New Roman" w:hAnsi="Times New Roman"/>
+                <w:b w:val="false"/>
+                <w:bCs w:val="false"/>
+                <w:i/>
+                <w:iCs/>
+                <w:color w:val="1A1A1A"/>
+                <w:sz w:val="24"/>
+                <w:szCs w:val="24"/>
+              </w:rPr>
+              <w:t xml:space="preserve">Heredero(a) / beneficiario(a)</w:t>
+            </w:r>
+          </w:p>
+        </w:tc>
+        <w:tc>
+          <w:tcPr>
+            <w:tcW w:type="dxa" w:w="4680"/>
+            <w:tcMar>
+              <w:top w:type="dxa" w:w="60"/>
+              <w:left w:type="dxa" w:w="120"/>
+              <w:bottom w:type="dxa" w:w="220"/>
+              <w:right w:type="dxa" w:w="120"/>
+            </w:tcMar>
+          </w:tcPr>
+          <w:p>
+            <w:pPr>
+              <w:spacing w:after="160"/>
+              <w:jc w:val="center"/>
+            </w:pPr>
+            <w:r>
+              <w:rPr>
+                <w:rFonts w:ascii="Times New Roman" w:cs="Times New Roman" w:eastAsia="Times New Roman" w:hAnsi="Times New Roman"/>
+                <w:b w:val="false"/>
+                <w:bCs w:val="false"/>
+                <w:i w:val="false"/>
+                <w:iCs w:val="false"/>
+                <w:color w:val="1A1A1A"/>
+                <w:sz w:val="24"/>
+                <w:szCs w:val="24"/>
+              </w:rPr>
+              <w:t xml:space="preserve"/>
+            </w:r>
+          </w:p>
+          <w:p>
+            <w:pPr>
+              <w:spacing w:after="0"/>
+              <w:jc w:val="center"/>
+            </w:pPr>
+            <w:r>
+              <w:rPr>
+                <w:rFonts w:ascii="Times New Roman" w:cs="Times New Roman" w:eastAsia="Times New Roman" w:hAnsi="Times New Roman"/>
+                <w:b w:val="false"/>
+                <w:bCs w:val="false"/>
+                <w:i w:val="false"/>
+                <w:iCs w:val="false"/>
+                <w:color w:val="1A1A1A"/>
+                <w:sz w:val="24"/>
+                <w:szCs w:val="24"/>
+              </w:rPr>
+              <w:t xml:space="preserve">____________________________________</w:t>
+            </w:r>
+          </w:p>
+          <w:p>
+            <w:pPr>
+              <w:spacing w:after="0"/>
+              <w:jc w:val="center"/>
+            </w:pPr>
+            <w:r>
+              <w:rPr>
+                <w:rFonts w:ascii="Times New Roman" w:cs="Times New Roman" w:eastAsia="Times New Roman" w:hAnsi="Times New Roman"/>
+                <w:b w:val="false"/>
+                <w:bCs w:val="false"/>
+                <w:i w:val="false"/>
+                <w:iCs w:val="false"/>
+                <w:color w:val="1A1A1A"/>
+                <w:sz w:val="24"/>
+                <w:szCs w:val="24"/>
+              </w:rPr>
+              <w:t xml:space="preserve">Nombre: ____________________________</w:t>
+            </w:r>
+          </w:p>
+          <w:p>
+            <w:pPr>
+              <w:spacing w:after="0"/>
+              <w:jc w:val="center"/>
+            </w:pPr>
+            <w:r>
+              <w:rPr>
+                <w:rFonts w:ascii="Times New Roman" w:cs="Times New Roman" w:eastAsia="Times New Roman" w:hAnsi="Times New Roman"/>
+                <w:b w:val="false"/>
+                <w:bCs w:val="false"/>
+                <w:i/>
+                <w:iCs/>
+                <w:color w:val="1A1A1A"/>
+                <w:sz w:val="24"/>
+                <w:szCs w:val="24"/>
+              </w:rPr>
+              <w:t xml:space="preserve">Heredero(a) / beneficiario(a)</w:t>
+            </w:r>
+          </w:p>
+        </w:tc>
+      </w:tr>
+      <w:tr>
+        <w:tc>
+          <w:tcPr>
+            <w:tcW w:type="dxa" w:w="4680"/>
+            <w:tcMar>
+              <w:top w:type="dxa" w:w="60"/>
+              <w:left w:type="dxa" w:w="120"/>
+              <w:bottom w:type="dxa" w:w="220"/>
+              <w:right w:type="dxa" w:w="120"/>
+            </w:tcMar>
+          </w:tcPr>
+          <w:p>
+            <w:pPr>
+              <w:spacing w:after="160"/>
+              <w:jc w:val="center"/>
+            </w:pPr>
+            <w:r>
+              <w:rPr>
+                <w:rFonts w:ascii="Times New Roman" w:cs="Times New Roman" w:eastAsia="Times New Roman" w:hAnsi="Times New Roman"/>
+                <w:b w:val="false"/>
+                <w:bCs w:val="false"/>
+                <w:i w:val="false"/>
+                <w:iCs w:val="false"/>
+                <w:color w:val="1A1A1A"/>
+                <w:sz w:val="24"/>
+                <w:szCs w:val="24"/>
+              </w:rPr>
+              <w:t xml:space="preserve"/>
+            </w:r>
+          </w:p>
+          <w:p>
+            <w:pPr>
+              <w:spacing w:after="0"/>
+              <w:jc w:val="center"/>
+            </w:pPr>
+            <w:r>
+              <w:rPr>
+                <w:rFonts w:ascii="Times New Roman" w:cs="Times New Roman" w:eastAsia="Times New Roman" w:hAnsi="Times New Roman"/>
+                <w:b w:val="false"/>
+                <w:bCs w:val="false"/>
+                <w:i w:val="false"/>
+                <w:iCs w:val="false"/>
+                <w:color w:val="1A1A1A"/>
+                <w:sz w:val="24"/>
+                <w:szCs w:val="24"/>
+              </w:rPr>
+              <w:t xml:space="preserve">____________________________________</w:t>
+            </w:r>
+          </w:p>
+          <w:p>
+            <w:pPr>
+              <w:spacing w:after="0"/>
+              <w:jc w:val="center"/>
+            </w:pPr>
+            <w:r>
+              <w:rPr>
+                <w:rFonts w:ascii="Times New Roman" w:cs="Times New Roman" w:eastAsia="Times New Roman" w:hAnsi="Times New Roman"/>
+                <w:b w:val="false"/>
+                <w:bCs w:val="false"/>
+                <w:i w:val="false"/>
+                <w:iCs w:val="false"/>
+                <w:color w:val="1A1A1A"/>
+                <w:sz w:val="24"/>
+                <w:szCs w:val="24"/>
+              </w:rPr>
+              <w:t xml:space="preserve">Nombre: ____________________________</w:t>
+            </w:r>
+          </w:p>
+          <w:p>
+            <w:pPr>
+              <w:spacing w:after="0"/>
+              <w:jc w:val="center"/>
+            </w:pPr>
+            <w:r>
+              <w:rPr>
+                <w:rFonts w:ascii="Times New Roman" w:cs="Times New Roman" w:eastAsia="Times New Roman" w:hAnsi="Times New Roman"/>
+                <w:b w:val="false"/>
+                <w:bCs w:val="false"/>
+                <w:i/>
+                <w:iCs/>
+                <w:color w:val="1A1A1A"/>
+                <w:sz w:val="24"/>
+                <w:szCs w:val="24"/>
+              </w:rPr>
+              <w:t xml:space="preserve">Heredero(a) / beneficiario(a)</w:t>
+            </w:r>
+          </w:p>
+        </w:tc>
+        <w:tc>
+          <w:tcPr>
+            <w:tcW w:type="dxa" w:w="4680"/>
+            <w:tcMar>
+              <w:top w:type="dxa" w:w="60"/>
+              <w:left w:type="dxa" w:w="120"/>
+              <w:bottom w:type="dxa" w:w="220"/>
+              <w:right w:type="dxa" w:w="120"/>
+            </w:tcMar>
+          </w:tcPr>
+          <w:p>
+            <w:pPr>
+              <w:spacing w:after="160"/>
+              <w:jc w:val="center"/>
+            </w:pPr>
+            <w:r>
+              <w:rPr>
+                <w:rFonts w:ascii="Times New Roman" w:cs="Times New Roman" w:eastAsia="Times New Roman" w:hAnsi="Times New Roman"/>
+                <w:b w:val="false"/>
+                <w:bCs w:val="false"/>
+                <w:i w:val="false"/>
+                <w:iCs w:val="false"/>
+                <w:color w:val="1A1A1A"/>
+                <w:sz w:val="24"/>
+                <w:szCs w:val="24"/>
+              </w:rPr>
+              <w:t xml:space="preserve"/>
+            </w:r>
+          </w:p>
+          <w:p>
+            <w:pPr>
+              <w:spacing w:after="0"/>
+              <w:jc w:val="center"/>
+            </w:pPr>
+            <w:r>
+              <w:rPr>
+                <w:rFonts w:ascii="Times New Roman" w:cs="Times New Roman" w:eastAsia="Times New Roman" w:hAnsi="Times New Roman"/>
+                <w:b w:val="false"/>
+                <w:bCs w:val="false"/>
+                <w:i w:val="false"/>
+                <w:iCs w:val="false"/>
+                <w:color w:val="1A1A1A"/>
+                <w:sz w:val="24"/>
+                <w:szCs w:val="24"/>
+              </w:rPr>
+              <w:t xml:space="preserve">____________________________________</w:t>
+            </w:r>
+          </w:p>
+          <w:p>
+            <w:pPr>
+              <w:spacing w:after="0"/>
+              <w:jc w:val="center"/>
+            </w:pPr>
+            <w:r>
+              <w:rPr>
+                <w:rFonts w:ascii="Times New Roman" w:cs="Times New Roman" w:eastAsia="Times New Roman" w:hAnsi="Times New Roman"/>
+                <w:b w:val="false"/>
+                <w:bCs w:val="false"/>
+                <w:i w:val="false"/>
+                <w:iCs w:val="false"/>
+                <w:color w:val="1A1A1A"/>
+                <w:sz w:val="24"/>
+                <w:szCs w:val="24"/>
+              </w:rPr>
+              <w:t xml:space="preserve">Nombre: ____________________________</w:t>
+            </w:r>
+          </w:p>
+          <w:p>
+            <w:pPr>
+              <w:spacing w:after="0"/>
+              <w:jc w:val="center"/>
+            </w:pPr>
+            <w:r>
+              <w:rPr>
+                <w:rFonts w:ascii="Times New Roman" w:cs="Times New Roman" w:eastAsia="Times New Roman" w:hAnsi="Times New Roman"/>
+                <w:b w:val="false"/>
+                <w:bCs w:val="false"/>
+                <w:i/>
+                <w:iCs/>
+                <w:color w:val="1A1A1A"/>
+                <w:sz w:val="24"/>
+                <w:szCs w:val="24"/>
+              </w:rPr>
+              <w:t xml:space="preserve">Heredero(a) / beneficiario(a)</w:t>
+            </w:r>
+          </w:p>
+        </w:tc>
+      </w:tr>
+    </w:tbl>
+    <w:p>
+      <w:pPr>
+        <w:spacing w:after="120" w:line="276"/>
+        <w:jc w:val="both"/>
+      </w:pPr>
+      <w:r>
+        <w:rPr>
+          <w:rFonts w:ascii="Times New Roman" w:cs="Times New Roman" w:eastAsia="Times New Roman" w:hAnsi="Times New Roman"/>
+          <w:b w:val="false"/>
+          <w:bCs w:val="false"/>
+          <w:i w:val="false"/>
+          <w:iCs w:val="false"/>
+          <w:color w:val="1A1A1A"/>
+          <w:sz w:val="24"/>
+          <w:szCs w:val="24"/>
+        </w:rPr>
+        <w:t xml:space="preserve"/>
+      </w:r>
+    </w:p>
+    <w:p>
+      <w:pPr>
+        <w:spacing w:after="220" w:line="276"/>
         <w:jc w:val="center"/>
       </w:pPr>
       <w:r>
@@ -676,12 +1468,12 @@
           <w:sz w:val="24"/>
           <w:szCs w:val="24"/>
         </w:rPr>
-        <w:t xml:space="preserve">C. Adriana Margarita Pérez Román</w:t>
-      </w:r>
-    </w:p>
-    <w:p>
-      <w:pPr>
-        <w:spacing w:after="0" w:line="276"/>
+        <w:t xml:space="preserve">ACEPTA LA CESIÓN — LA CESIONARIA</w:t>
+      </w:r>
+    </w:p>
+    <w:p>
+      <w:pPr>
+        <w:spacing w:after="0"/>
         <w:jc w:val="center"/>
       </w:pPr>
       <w:r>
@@ -695,17 +1487,55 @@
           <w:sz w:val="24"/>
           <w:szCs w:val="24"/>
         </w:rPr>
-        <w:t xml:space="preserve">Solicitante — hija del finado titular (cedente)</w:t>
-      </w:r>
-    </w:p>
-    <w:p>
-      <w:pPr>
-        <w:spacing w:after="560" w:line="276"/>
+        <w:t xml:space="preserve">____________________________________</w:t>
+      </w:r>
+    </w:p>
+    <w:p>
+      <w:pPr>
+        <w:spacing w:after="0"/>
         <w:jc w:val="center"/>
       </w:pPr>
       <w:r>
         <w:rPr>
           <w:rFonts w:ascii="Times New Roman" w:cs="Times New Roman" w:eastAsia="Times New Roman" w:hAnsi="Times New Roman"/>
+          <w:b/>
+          <w:bCs/>
+          <w:i w:val="false"/>
+          <w:iCs w:val="false"/>
+          <w:color w:val="1A1A1A"/>
+          <w:sz w:val="24"/>
+          <w:szCs w:val="24"/>
+        </w:rPr>
+        <w:t xml:space="preserve">C. Francisca Fernández Acuña</w:t>
+      </w:r>
+    </w:p>
+    <w:p>
+      <w:pPr>
+        <w:spacing w:after="0"/>
+        <w:jc w:val="center"/>
+      </w:pPr>
+      <w:r>
+        <w:rPr>
+          <w:rFonts w:ascii="Times New Roman" w:cs="Times New Roman" w:eastAsia="Times New Roman" w:hAnsi="Times New Roman"/>
+          <w:b w:val="false"/>
+          <w:bCs w:val="false"/>
+          <w:i/>
+          <w:iCs/>
+          <w:color w:val="1A1A1A"/>
+          <w:sz w:val="24"/>
+          <w:szCs w:val="24"/>
+        </w:rPr>
+        <w:t xml:space="preserve">Cesionaria (beneficiaria) — De conformidad</w:t>
+      </w:r>
+    </w:p>
+    <w:p>
+      <w:pPr>
+        <w:spacing w:after="320"/>
+        <w:jc w:val="center"/>
+      </w:pPr>
+      <w:r>
+        <w:rPr>
+          <w:rFonts w:ascii="Times New Roman" w:cs="Times New Roman" w:eastAsia="Times New Roman" w:hAnsi="Times New Roman"/>
           <w:b w:val="false"/>
           <w:bCs w:val="false"/>
           <w:i w:val="false"/>
@@ -719,83 +1549,7 @@
     </w:p>
     <w:p>
       <w:pPr>
-        <w:spacing w:after="0" w:line="276"/>
-        <w:jc w:val="center"/>
-      </w:pPr>
-      <w:r>
-        <w:rPr>
-          <w:rFonts w:ascii="Times New Roman" w:cs="Times New Roman" w:eastAsia="Times New Roman" w:hAnsi="Times New Roman"/>
-          <w:b w:val="false"/>
-          <w:bCs w:val="false"/>
-          <w:i w:val="false"/>
-          <w:iCs w:val="false"/>
-          <w:color w:val="1A1A1A"/>
-          <w:sz w:val="24"/>
-          <w:szCs w:val="24"/>
-        </w:rPr>
-        <w:t xml:space="preserve">_______________________________________</w:t>
-      </w:r>
-    </w:p>
-    <w:p>
-      <w:pPr>
-        <w:spacing w:after="0" w:line="276"/>
-        <w:jc w:val="center"/>
-      </w:pPr>
-      <w:r>
-        <w:rPr>
-          <w:rFonts w:ascii="Times New Roman" w:cs="Times New Roman" w:eastAsia="Times New Roman" w:hAnsi="Times New Roman"/>
-          <w:b/>
-          <w:bCs/>
-          <w:i w:val="false"/>
-          <w:iCs w:val="false"/>
-          <w:color w:val="1A1A1A"/>
-          <w:sz w:val="24"/>
-          <w:szCs w:val="24"/>
-        </w:rPr>
-        <w:t xml:space="preserve">C. Francisca Fernández Acuña</w:t>
-      </w:r>
-    </w:p>
-    <w:p>
-      <w:pPr>
-        <w:spacing w:after="0" w:line="276"/>
-        <w:jc w:val="center"/>
-      </w:pPr>
-      <w:r>
-        <w:rPr>
-          <w:rFonts w:ascii="Times New Roman" w:cs="Times New Roman" w:eastAsia="Times New Roman" w:hAnsi="Times New Roman"/>
-          <w:b w:val="false"/>
-          <w:bCs w:val="false"/>
-          <w:i w:val="false"/>
-          <w:iCs w:val="false"/>
-          <w:color w:val="1A1A1A"/>
-          <w:sz w:val="24"/>
-          <w:szCs w:val="24"/>
-        </w:rPr>
-        <w:t xml:space="preserve">Cesionaria (beneficiaria) — De conformidad</w:t>
-      </w:r>
-    </w:p>
-    <w:p>
-      <w:pPr>
-        <w:spacing w:after="560" w:line="276"/>
-        <w:jc w:val="center"/>
-      </w:pPr>
-      <w:r>
-        <w:rPr>
-          <w:rFonts w:ascii="Times New Roman" w:cs="Times New Roman" w:eastAsia="Times New Roman" w:hAnsi="Times New Roman"/>
-          <w:b w:val="false"/>
-          <w:bCs w:val="false"/>
-          <w:i w:val="false"/>
-          <w:iCs w:val="false"/>
-          <w:color w:val="1A1A1A"/>
-          <w:sz w:val="24"/>
-          <w:szCs w:val="24"/>
-        </w:rPr>
-        <w:t xml:space="preserve">Identificación (INE) No.: ____________________</w:t>
-      </w:r>
-    </w:p>
-    <w:p>
-      <w:pPr>
-        <w:spacing w:after="360" w:line="276"/>
+        <w:spacing w:after="280" w:line="276"/>
         <w:jc w:val="center"/>
       </w:pPr>
       <w:r>

</xml_diff>